<commit_message>
Update CFD Spanish formatting rules
</commit_message>
<xml_diff>
--- a/Project Rooms/Contract for Deed/output/320 Rose - Contract for Deed Agreement - BILINGUAL SPANISH DRAFT.docx
+++ b/Project Rooms/Contract for Deed/output/320 Rose - Contract for Deed Agreement - BILINGUAL SPANISH DRAFT.docx
@@ -26,13 +26,11 @@
     <w:p>
       <w:pPr>
         <w:pStyle w:val="SpanishTranslationDraft"/>
-        <w:spacing w:before="0" w:after="120"/>
-        <w:ind w:left="259"/>
-      </w:pPr>
-      <w:r>
-        <w:rPr>
-          <w:rFonts w:ascii="Times New Roman" w:hAnsi="Times New Roman"/>
-          <w:i/>
+        <w:ind w:right="259"/>
+      </w:pPr>
+      <w:r>
+        <w:rPr>
+          <w:rFonts w:ascii="Arial" w:hAnsi="Arial"/>
           <w:color w:val="0066CC"/>
           <w:sz w:val="18"/>
         </w:rPr>
@@ -82,13 +80,11 @@
     <w:p>
       <w:pPr>
         <w:pStyle w:val="SpanishTranslationDraft"/>
-        <w:spacing w:before="0" w:after="120"/>
-        <w:ind w:left="259"/>
-      </w:pPr>
-      <w:r>
-        <w:rPr>
-          <w:rFonts w:ascii="Times New Roman" w:hAnsi="Times New Roman"/>
-          <w:i/>
+        <w:ind w:right="259"/>
+      </w:pPr>
+      <w:r>
+        <w:rPr>
+          <w:rFonts w:ascii="Arial" w:hAnsi="Arial"/>
           <w:color w:val="0066CC"/>
           <w:sz w:val="18"/>
         </w:rPr>
@@ -128,13 +124,12 @@
     <w:p>
       <w:pPr>
         <w:pStyle w:val="SpanishTranslationDraft"/>
-        <w:spacing w:before="0" w:after="120"/>
-        <w:ind w:left="259"/>
-      </w:pPr>
-      <w:r>
-        <w:rPr>
-          <w:rFonts w:ascii="Times New Roman" w:hAnsi="Times New Roman"/>
-          <w:i/>
+        <w:ind w:right="259"/>
+        <w:jc w:val="center"/>
+      </w:pPr>
+      <w:r>
+        <w:rPr>
+          <w:rFonts w:ascii="Arial" w:hAnsi="Arial"/>
           <w:color w:val="0066CC"/>
           <w:sz w:val="18"/>
         </w:rPr>
@@ -180,13 +175,11 @@
     <w:p>
       <w:pPr>
         <w:pStyle w:val="SpanishTranslationDraft"/>
-        <w:spacing w:before="0" w:after="120"/>
-        <w:ind w:left="259"/>
-      </w:pPr>
-      <w:r>
-        <w:rPr>
-          <w:rFonts w:ascii="Times New Roman" w:hAnsi="Times New Roman"/>
-          <w:i/>
+        <w:ind w:right="259"/>
+      </w:pPr>
+      <w:r>
+        <w:rPr>
+          <w:rFonts w:ascii="Arial" w:hAnsi="Arial"/>
           <w:color w:val="0066CC"/>
           <w:sz w:val="18"/>
         </w:rPr>
@@ -219,13 +212,11 @@
     <w:p>
       <w:pPr>
         <w:pStyle w:val="SpanishTranslationDraft"/>
-        <w:spacing w:before="0" w:after="120"/>
-        <w:ind w:left="259"/>
-      </w:pPr>
-      <w:r>
-        <w:rPr>
-          <w:rFonts w:ascii="Times New Roman" w:hAnsi="Times New Roman"/>
-          <w:i/>
+        <w:ind w:right="259"/>
+      </w:pPr>
+      <w:r>
+        <w:rPr>
+          <w:rFonts w:ascii="Arial" w:hAnsi="Arial"/>
           <w:color w:val="0066CC"/>
           <w:sz w:val="18"/>
         </w:rPr>
@@ -258,13 +249,11 @@
     <w:p>
       <w:pPr>
         <w:pStyle w:val="SpanishTranslationDraft"/>
-        <w:spacing w:before="0" w:after="120"/>
-        <w:ind w:left="259"/>
-      </w:pPr>
-      <w:r>
-        <w:rPr>
-          <w:rFonts w:ascii="Times New Roman" w:hAnsi="Times New Roman"/>
-          <w:i/>
+        <w:ind w:right="259"/>
+      </w:pPr>
+      <w:r>
+        <w:rPr>
+          <w:rFonts w:ascii="Arial" w:hAnsi="Arial"/>
           <w:color w:val="0066CC"/>
           <w:sz w:val="18"/>
         </w:rPr>
@@ -297,13 +286,11 @@
     <w:p>
       <w:pPr>
         <w:pStyle w:val="SpanishTranslationDraft"/>
-        <w:spacing w:before="0" w:after="120"/>
-        <w:ind w:left="259"/>
-      </w:pPr>
-      <w:r>
-        <w:rPr>
-          <w:rFonts w:ascii="Times New Roman" w:hAnsi="Times New Roman"/>
-          <w:i/>
+        <w:ind w:right="259"/>
+      </w:pPr>
+      <w:r>
+        <w:rPr>
+          <w:rFonts w:ascii="Arial" w:hAnsi="Arial"/>
           <w:color w:val="0066CC"/>
           <w:sz w:val="18"/>
         </w:rPr>
@@ -343,13 +330,12 @@
     <w:p>
       <w:pPr>
         <w:pStyle w:val="SpanishTranslationDraft"/>
-        <w:spacing w:before="0" w:after="120"/>
-        <w:ind w:left="259"/>
-      </w:pPr>
-      <w:r>
-        <w:rPr>
-          <w:rFonts w:ascii="Times New Roman" w:hAnsi="Times New Roman"/>
-          <w:i/>
+        <w:ind w:right="259"/>
+        <w:jc w:val="center"/>
+      </w:pPr>
+      <w:r>
+        <w:rPr>
+          <w:rFonts w:ascii="Arial" w:hAnsi="Arial"/>
           <w:color w:val="0066CC"/>
           <w:sz w:val="18"/>
         </w:rPr>
@@ -389,13 +375,11 @@
     <w:p>
       <w:pPr>
         <w:pStyle w:val="SpanishTranslationDraft"/>
-        <w:spacing w:before="0" w:after="120"/>
-        <w:ind w:left="259"/>
-      </w:pPr>
-      <w:r>
-        <w:rPr>
-          <w:rFonts w:ascii="Times New Roman" w:hAnsi="Times New Roman"/>
-          <w:i/>
+        <w:ind w:right="259"/>
+      </w:pPr>
+      <w:r>
+        <w:rPr>
+          <w:rFonts w:ascii="Arial" w:hAnsi="Arial"/>
           <w:color w:val="0066CC"/>
           <w:sz w:val="18"/>
         </w:rPr>
@@ -429,13 +413,11 @@
     <w:p>
       <w:pPr>
         <w:pStyle w:val="SpanishTranslationDraft"/>
-        <w:spacing w:before="0" w:after="120"/>
-        <w:ind w:left="259"/>
-      </w:pPr>
-      <w:r>
-        <w:rPr>
-          <w:rFonts w:ascii="Times New Roman" w:hAnsi="Times New Roman"/>
-          <w:i/>
+        <w:ind w:right="259"/>
+      </w:pPr>
+      <w:r>
+        <w:rPr>
+          <w:rFonts w:ascii="Arial" w:hAnsi="Arial"/>
           <w:color w:val="0066CC"/>
           <w:sz w:val="18"/>
         </w:rPr>
@@ -469,13 +451,11 @@
     <w:p>
       <w:pPr>
         <w:pStyle w:val="SpanishTranslationDraft"/>
-        <w:spacing w:before="0" w:after="120"/>
-        <w:ind w:left="259"/>
-      </w:pPr>
-      <w:r>
-        <w:rPr>
-          <w:rFonts w:ascii="Times New Roman" w:hAnsi="Times New Roman"/>
-          <w:i/>
+        <w:ind w:right="259"/>
+      </w:pPr>
+      <w:r>
+        <w:rPr>
+          <w:rFonts w:ascii="Arial" w:hAnsi="Arial"/>
           <w:color w:val="0066CC"/>
           <w:sz w:val="18"/>
         </w:rPr>
@@ -536,13 +516,11 @@
     <w:p>
       <w:pPr>
         <w:pStyle w:val="SpanishTranslationDraft"/>
-        <w:spacing w:before="0" w:after="120"/>
-        <w:ind w:left="259"/>
-      </w:pPr>
-      <w:r>
-        <w:rPr>
-          <w:rFonts w:ascii="Times New Roman" w:hAnsi="Times New Roman"/>
-          <w:i/>
+        <w:ind w:right="259"/>
+      </w:pPr>
+      <w:r>
+        <w:rPr>
+          <w:rFonts w:ascii="Arial" w:hAnsi="Arial"/>
           <w:color w:val="0066CC"/>
           <w:sz w:val="18"/>
         </w:rPr>
@@ -552,13 +530,11 @@
     <w:p>
       <w:pPr>
         <w:pStyle w:val="SpanishTranslationDraft"/>
-        <w:spacing w:before="0" w:after="120"/>
-        <w:ind w:left="259"/>
-      </w:pPr>
-      <w:r>
-        <w:rPr>
-          <w:rFonts w:ascii="Times New Roman" w:hAnsi="Times New Roman"/>
-          <w:i/>
+        <w:ind w:right="259"/>
+      </w:pPr>
+      <w:r>
+        <w:rPr>
+          <w:rFonts w:ascii="Arial" w:hAnsi="Arial"/>
           <w:color w:val="0066CC"/>
           <w:sz w:val="18"/>
         </w:rPr>
@@ -568,13 +544,11 @@
     <w:p>
       <w:pPr>
         <w:pStyle w:val="SpanishTranslationDraft"/>
-        <w:spacing w:before="0" w:after="120"/>
-        <w:ind w:left="259"/>
-      </w:pPr>
-      <w:r>
-        <w:rPr>
-          <w:rFonts w:ascii="Times New Roman" w:hAnsi="Times New Roman"/>
-          <w:i/>
+        <w:ind w:right="259"/>
+      </w:pPr>
+      <w:r>
+        <w:rPr>
+          <w:rFonts w:ascii="Arial" w:hAnsi="Arial"/>
           <w:color w:val="0066CC"/>
           <w:sz w:val="18"/>
         </w:rPr>
@@ -635,13 +609,11 @@
     <w:p>
       <w:pPr>
         <w:pStyle w:val="SpanishTranslationDraft"/>
-        <w:spacing w:before="0" w:after="120"/>
-        <w:ind w:left="259"/>
-      </w:pPr>
-      <w:r>
-        <w:rPr>
-          <w:rFonts w:ascii="Times New Roman" w:hAnsi="Times New Roman"/>
-          <w:i/>
+        <w:ind w:right="259"/>
+      </w:pPr>
+      <w:r>
+        <w:rPr>
+          <w:rFonts w:ascii="Arial" w:hAnsi="Arial"/>
           <w:color w:val="0066CC"/>
           <w:sz w:val="18"/>
         </w:rPr>
@@ -666,13 +638,11 @@
     <w:p>
       <w:pPr>
         <w:pStyle w:val="SpanishTranslationDraft"/>
-        <w:spacing w:before="0" w:after="120"/>
-        <w:ind w:left="259"/>
-      </w:pPr>
-      <w:r>
-        <w:rPr>
-          <w:rFonts w:ascii="Times New Roman" w:hAnsi="Times New Roman"/>
-          <w:i/>
+        <w:ind w:right="259"/>
+      </w:pPr>
+      <w:r>
+        <w:rPr>
+          <w:rFonts w:ascii="Arial" w:hAnsi="Arial"/>
           <w:color w:val="0066CC"/>
           <w:sz w:val="18"/>
         </w:rPr>
@@ -697,13 +667,11 @@
     <w:p>
       <w:pPr>
         <w:pStyle w:val="SpanishTranslationDraft"/>
-        <w:spacing w:before="0" w:after="120"/>
-        <w:ind w:left="259"/>
-      </w:pPr>
-      <w:r>
-        <w:rPr>
-          <w:rFonts w:ascii="Times New Roman" w:hAnsi="Times New Roman"/>
-          <w:i/>
+        <w:ind w:right="259"/>
+      </w:pPr>
+      <w:r>
+        <w:rPr>
+          <w:rFonts w:ascii="Arial" w:hAnsi="Arial"/>
           <w:color w:val="0066CC"/>
           <w:sz w:val="18"/>
         </w:rPr>
@@ -728,13 +696,11 @@
     <w:p>
       <w:pPr>
         <w:pStyle w:val="SpanishTranslationDraft"/>
-        <w:spacing w:before="0" w:after="120"/>
-        <w:ind w:left="259"/>
-      </w:pPr>
-      <w:r>
-        <w:rPr>
-          <w:rFonts w:ascii="Times New Roman" w:hAnsi="Times New Roman"/>
-          <w:i/>
+        <w:ind w:right="259"/>
+      </w:pPr>
+      <w:r>
+        <w:rPr>
+          <w:rFonts w:ascii="Arial" w:hAnsi="Arial"/>
           <w:color w:val="0066CC"/>
           <w:sz w:val="18"/>
         </w:rPr>
@@ -791,13 +757,11 @@
     <w:p>
       <w:pPr>
         <w:pStyle w:val="SpanishTranslationDraft"/>
-        <w:spacing w:before="0" w:after="120"/>
-        <w:ind w:left="259"/>
-      </w:pPr>
-      <w:r>
-        <w:rPr>
-          <w:rFonts w:ascii="Times New Roman" w:hAnsi="Times New Roman"/>
-          <w:i/>
+        <w:ind w:right="259"/>
+      </w:pPr>
+      <w:r>
+        <w:rPr>
+          <w:rFonts w:ascii="Arial" w:hAnsi="Arial"/>
           <w:color w:val="0066CC"/>
           <w:sz w:val="18"/>
         </w:rPr>
@@ -833,13 +797,11 @@
     <w:p>
       <w:pPr>
         <w:pStyle w:val="SpanishTranslationDraft"/>
-        <w:spacing w:before="0" w:after="120"/>
-        <w:ind w:left="259"/>
-      </w:pPr>
-      <w:r>
-        <w:rPr>
-          <w:rFonts w:ascii="Times New Roman" w:hAnsi="Times New Roman"/>
-          <w:i/>
+        <w:ind w:right="259"/>
+      </w:pPr>
+      <w:r>
+        <w:rPr>
+          <w:rFonts w:ascii="Arial" w:hAnsi="Arial"/>
           <w:color w:val="0066CC"/>
           <w:sz w:val="18"/>
         </w:rPr>
@@ -893,13 +855,11 @@
     <w:p>
       <w:pPr>
         <w:pStyle w:val="SpanishTranslationDraft"/>
-        <w:spacing w:before="0" w:after="120"/>
-        <w:ind w:left="259"/>
-      </w:pPr>
-      <w:r>
-        <w:rPr>
-          <w:rFonts w:ascii="Times New Roman" w:hAnsi="Times New Roman"/>
-          <w:i/>
+        <w:ind w:right="259"/>
+      </w:pPr>
+      <w:r>
+        <w:rPr>
+          <w:rFonts w:ascii="Arial" w:hAnsi="Arial"/>
           <w:color w:val="0066CC"/>
           <w:sz w:val="18"/>
         </w:rPr>
@@ -981,13 +941,11 @@
     <w:p>
       <w:pPr>
         <w:pStyle w:val="SpanishTranslationDraft"/>
-        <w:spacing w:before="0" w:after="120"/>
-        <w:ind w:left="259"/>
-      </w:pPr>
-      <w:r>
-        <w:rPr>
-          <w:rFonts w:ascii="Times New Roman" w:hAnsi="Times New Roman"/>
-          <w:i/>
+        <w:ind w:right="259"/>
+      </w:pPr>
+      <w:r>
+        <w:rPr>
+          <w:rFonts w:ascii="Arial" w:hAnsi="Arial"/>
           <w:color w:val="0066CC"/>
           <w:sz w:val="18"/>
         </w:rPr>
@@ -1483,13 +1441,11 @@
     <w:p>
       <w:pPr>
         <w:pStyle w:val="SpanishTranslationDraft"/>
-        <w:spacing w:before="0" w:after="120"/>
-        <w:ind w:left="259"/>
-      </w:pPr>
-      <w:r>
-        <w:rPr>
-          <w:rFonts w:ascii="Times New Roman" w:hAnsi="Times New Roman"/>
-          <w:i/>
+        <w:ind w:right="259"/>
+      </w:pPr>
+      <w:r>
+        <w:rPr>
+          <w:rFonts w:ascii="Arial" w:hAnsi="Arial"/>
           <w:color w:val="0066CC"/>
           <w:sz w:val="18"/>
         </w:rPr>
@@ -1526,13 +1482,11 @@
     <w:p>
       <w:pPr>
         <w:pStyle w:val="SpanishTranslationDraft"/>
-        <w:spacing w:before="0" w:after="120"/>
-        <w:ind w:left="259"/>
-      </w:pPr>
-      <w:r>
-        <w:rPr>
-          <w:rFonts w:ascii="Times New Roman" w:hAnsi="Times New Roman"/>
-          <w:i/>
+        <w:ind w:right="259"/>
+      </w:pPr>
+      <w:r>
+        <w:rPr>
+          <w:rFonts w:ascii="Arial" w:hAnsi="Arial"/>
           <w:color w:val="0066CC"/>
           <w:sz w:val="18"/>
         </w:rPr>
@@ -1569,13 +1523,11 @@
     <w:p>
       <w:pPr>
         <w:pStyle w:val="SpanishTranslationDraft"/>
-        <w:spacing w:before="0" w:after="120"/>
-        <w:ind w:left="259"/>
-      </w:pPr>
-      <w:r>
-        <w:rPr>
-          <w:rFonts w:ascii="Times New Roman" w:hAnsi="Times New Roman"/>
-          <w:i/>
+        <w:ind w:right="259"/>
+      </w:pPr>
+      <w:r>
+        <w:rPr>
+          <w:rFonts w:ascii="Arial" w:hAnsi="Arial"/>
           <w:color w:val="0066CC"/>
           <w:sz w:val="18"/>
         </w:rPr>
@@ -1612,13 +1564,11 @@
     <w:p>
       <w:pPr>
         <w:pStyle w:val="SpanishTranslationDraft"/>
-        <w:spacing w:before="0" w:after="120"/>
-        <w:ind w:left="259"/>
-      </w:pPr>
-      <w:r>
-        <w:rPr>
-          <w:rFonts w:ascii="Times New Roman" w:hAnsi="Times New Roman"/>
-          <w:i/>
+        <w:ind w:right="259"/>
+      </w:pPr>
+      <w:r>
+        <w:rPr>
+          <w:rFonts w:ascii="Arial" w:hAnsi="Arial"/>
           <w:color w:val="0066CC"/>
           <w:sz w:val="18"/>
         </w:rPr>
@@ -1662,13 +1612,11 @@
     <w:p>
       <w:pPr>
         <w:pStyle w:val="SpanishTranslationDraft"/>
-        <w:spacing w:before="0" w:after="120"/>
-        <w:ind w:left="259"/>
-      </w:pPr>
-      <w:r>
-        <w:rPr>
-          <w:rFonts w:ascii="Times New Roman" w:hAnsi="Times New Roman"/>
-          <w:i/>
+        <w:ind w:right="259"/>
+      </w:pPr>
+      <w:r>
+        <w:rPr>
+          <w:rFonts w:ascii="Arial" w:hAnsi="Arial"/>
           <w:color w:val="0066CC"/>
           <w:sz w:val="18"/>
         </w:rPr>
@@ -1705,13 +1653,11 @@
     <w:p>
       <w:pPr>
         <w:pStyle w:val="SpanishTranslationDraft"/>
-        <w:spacing w:before="0" w:after="120"/>
-        <w:ind w:left="259"/>
-      </w:pPr>
-      <w:r>
-        <w:rPr>
-          <w:rFonts w:ascii="Times New Roman" w:hAnsi="Times New Roman"/>
-          <w:i/>
+        <w:ind w:right="259"/>
+      </w:pPr>
+      <w:r>
+        <w:rPr>
+          <w:rFonts w:ascii="Arial" w:hAnsi="Arial"/>
           <w:color w:val="0066CC"/>
           <w:sz w:val="18"/>
         </w:rPr>
@@ -1748,13 +1694,11 @@
     <w:p>
       <w:pPr>
         <w:pStyle w:val="SpanishTranslationDraft"/>
-        <w:spacing w:before="0" w:after="120"/>
-        <w:ind w:left="259"/>
-      </w:pPr>
-      <w:r>
-        <w:rPr>
-          <w:rFonts w:ascii="Times New Roman" w:hAnsi="Times New Roman"/>
-          <w:i/>
+        <w:ind w:right="259"/>
+      </w:pPr>
+      <w:r>
+        <w:rPr>
+          <w:rFonts w:ascii="Arial" w:hAnsi="Arial"/>
           <w:color w:val="0066CC"/>
           <w:sz w:val="18"/>
         </w:rPr>
@@ -1811,13 +1755,11 @@
     <w:p>
       <w:pPr>
         <w:pStyle w:val="SpanishTranslationDraft"/>
-        <w:spacing w:before="0" w:after="120"/>
-        <w:ind w:left="259"/>
-      </w:pPr>
-      <w:r>
-        <w:rPr>
-          <w:rFonts w:ascii="Times New Roman" w:hAnsi="Times New Roman"/>
-          <w:i/>
+        <w:ind w:right="259"/>
+      </w:pPr>
+      <w:r>
+        <w:rPr>
+          <w:rFonts w:ascii="Arial" w:hAnsi="Arial"/>
           <w:color w:val="0066CC"/>
           <w:sz w:val="18"/>
         </w:rPr>
@@ -1876,13 +1818,11 @@
     <w:p>
       <w:pPr>
         <w:pStyle w:val="SpanishTranslationDraft"/>
-        <w:spacing w:before="0" w:after="120"/>
-        <w:ind w:left="259"/>
-      </w:pPr>
-      <w:r>
-        <w:rPr>
-          <w:rFonts w:ascii="Times New Roman" w:hAnsi="Times New Roman"/>
-          <w:i/>
+        <w:ind w:right="259"/>
+      </w:pPr>
+      <w:r>
+        <w:rPr>
+          <w:rFonts w:ascii="Arial" w:hAnsi="Arial"/>
           <w:color w:val="0066CC"/>
           <w:sz w:val="18"/>
         </w:rPr>
@@ -1966,13 +1906,11 @@
     <w:p>
       <w:pPr>
         <w:pStyle w:val="SpanishTranslationDraft"/>
-        <w:spacing w:before="0" w:after="120"/>
-        <w:ind w:left="259"/>
-      </w:pPr>
-      <w:r>
-        <w:rPr>
-          <w:rFonts w:ascii="Times New Roman" w:hAnsi="Times New Roman"/>
-          <w:i/>
+        <w:ind w:right="259"/>
+      </w:pPr>
+      <w:r>
+        <w:rPr>
+          <w:rFonts w:ascii="Arial" w:hAnsi="Arial"/>
           <w:color w:val="0066CC"/>
           <w:sz w:val="18"/>
         </w:rPr>
@@ -2010,13 +1948,11 @@
     <w:p>
       <w:pPr>
         <w:pStyle w:val="SpanishTranslationDraft"/>
-        <w:spacing w:before="0" w:after="120"/>
-        <w:ind w:left="259"/>
-      </w:pPr>
-      <w:r>
-        <w:rPr>
-          <w:rFonts w:ascii="Times New Roman" w:hAnsi="Times New Roman"/>
-          <w:i/>
+        <w:ind w:right="259"/>
+      </w:pPr>
+      <w:r>
+        <w:rPr>
+          <w:rFonts w:ascii="Arial" w:hAnsi="Arial"/>
           <w:color w:val="0066CC"/>
           <w:sz w:val="18"/>
         </w:rPr>
@@ -2086,13 +2022,11 @@
     <w:p>
       <w:pPr>
         <w:pStyle w:val="SpanishTranslationDraft"/>
-        <w:spacing w:before="0" w:after="120"/>
-        <w:ind w:left="259"/>
-      </w:pPr>
-      <w:r>
-        <w:rPr>
-          <w:rFonts w:ascii="Times New Roman" w:hAnsi="Times New Roman"/>
-          <w:i/>
+        <w:ind w:right="259"/>
+      </w:pPr>
+      <w:r>
+        <w:rPr>
+          <w:rFonts w:ascii="Arial" w:hAnsi="Arial"/>
           <w:color w:val="0066CC"/>
           <w:sz w:val="18"/>
         </w:rPr>
@@ -2188,13 +2122,11 @@
     <w:p>
       <w:pPr>
         <w:pStyle w:val="SpanishTranslationDraft"/>
-        <w:spacing w:before="0" w:after="120"/>
-        <w:ind w:left="259"/>
-      </w:pPr>
-      <w:r>
-        <w:rPr>
-          <w:rFonts w:ascii="Times New Roman" w:hAnsi="Times New Roman"/>
-          <w:i/>
+        <w:ind w:right="259"/>
+      </w:pPr>
+      <w:r>
+        <w:rPr>
+          <w:rFonts w:ascii="Arial" w:hAnsi="Arial"/>
           <w:color w:val="0066CC"/>
           <w:sz w:val="18"/>
         </w:rPr>
@@ -2235,13 +2167,11 @@
     <w:p>
       <w:pPr>
         <w:pStyle w:val="SpanishTranslationDraft"/>
-        <w:spacing w:before="0" w:after="120"/>
-        <w:ind w:left="259"/>
-      </w:pPr>
-      <w:r>
-        <w:rPr>
-          <w:rFonts w:ascii="Times New Roman" w:hAnsi="Times New Roman"/>
-          <w:i/>
+        <w:ind w:right="259"/>
+      </w:pPr>
+      <w:r>
+        <w:rPr>
+          <w:rFonts w:ascii="Arial" w:hAnsi="Arial"/>
           <w:color w:val="0066CC"/>
           <w:sz w:val="18"/>
         </w:rPr>
@@ -2294,13 +2224,11 @@
     <w:p>
       <w:pPr>
         <w:pStyle w:val="SpanishTranslationDraft"/>
-        <w:spacing w:before="0" w:after="120"/>
-        <w:ind w:left="259"/>
-      </w:pPr>
-      <w:r>
-        <w:rPr>
-          <w:rFonts w:ascii="Times New Roman" w:hAnsi="Times New Roman"/>
-          <w:i/>
+        <w:ind w:right="259"/>
+      </w:pPr>
+      <w:r>
+        <w:rPr>
+          <w:rFonts w:ascii="Arial" w:hAnsi="Arial"/>
           <w:color w:val="0066CC"/>
           <w:sz w:val="18"/>
         </w:rPr>
@@ -2341,13 +2269,11 @@
     <w:p>
       <w:pPr>
         <w:pStyle w:val="SpanishTranslationDraft"/>
-        <w:spacing w:before="0" w:after="120"/>
-        <w:ind w:left="259"/>
-      </w:pPr>
-      <w:r>
-        <w:rPr>
-          <w:rFonts w:ascii="Times New Roman" w:hAnsi="Times New Roman"/>
-          <w:i/>
+        <w:ind w:right="259"/>
+      </w:pPr>
+      <w:r>
+        <w:rPr>
+          <w:rFonts w:ascii="Arial" w:hAnsi="Arial"/>
           <w:color w:val="0066CC"/>
           <w:sz w:val="18"/>
         </w:rPr>
@@ -2391,13 +2317,11 @@
     <w:p>
       <w:pPr>
         <w:pStyle w:val="SpanishTranslationDraft"/>
-        <w:spacing w:before="0" w:after="120"/>
-        <w:ind w:left="259"/>
-      </w:pPr>
-      <w:r>
-        <w:rPr>
-          <w:rFonts w:ascii="Times New Roman" w:hAnsi="Times New Roman"/>
-          <w:i/>
+        <w:ind w:right="259"/>
+      </w:pPr>
+      <w:r>
+        <w:rPr>
+          <w:rFonts w:ascii="Arial" w:hAnsi="Arial"/>
           <w:color w:val="0066CC"/>
           <w:sz w:val="18"/>
         </w:rPr>
@@ -2459,13 +2383,11 @@
     <w:p>
       <w:pPr>
         <w:pStyle w:val="SpanishTranslationDraft"/>
-        <w:spacing w:before="0" w:after="120"/>
-        <w:ind w:left="259"/>
-      </w:pPr>
-      <w:r>
-        <w:rPr>
-          <w:rFonts w:ascii="Times New Roman" w:hAnsi="Times New Roman"/>
-          <w:i/>
+        <w:ind w:right="259"/>
+      </w:pPr>
+      <w:r>
+        <w:rPr>
+          <w:rFonts w:ascii="Arial" w:hAnsi="Arial"/>
           <w:color w:val="0066CC"/>
           <w:sz w:val="18"/>
         </w:rPr>
@@ -2527,13 +2449,11 @@
     <w:p>
       <w:pPr>
         <w:pStyle w:val="SpanishTranslationDraft"/>
-        <w:spacing w:before="0" w:after="120"/>
-        <w:ind w:left="259"/>
-      </w:pPr>
-      <w:r>
-        <w:rPr>
-          <w:rFonts w:ascii="Times New Roman" w:hAnsi="Times New Roman"/>
-          <w:i/>
+        <w:ind w:right="259"/>
+      </w:pPr>
+      <w:r>
+        <w:rPr>
+          <w:rFonts w:ascii="Arial" w:hAnsi="Arial"/>
           <w:color w:val="0066CC"/>
           <w:sz w:val="18"/>
         </w:rPr>
@@ -2595,13 +2515,11 @@
     <w:p>
       <w:pPr>
         <w:pStyle w:val="SpanishTranslationDraft"/>
-        <w:spacing w:before="0" w:after="120"/>
-        <w:ind w:left="259"/>
-      </w:pPr>
-      <w:r>
-        <w:rPr>
-          <w:rFonts w:ascii="Times New Roman" w:hAnsi="Times New Roman"/>
-          <w:i/>
+        <w:ind w:right="259"/>
+      </w:pPr>
+      <w:r>
+        <w:rPr>
+          <w:rFonts w:ascii="Arial" w:hAnsi="Arial"/>
           <w:color w:val="0066CC"/>
           <w:sz w:val="18"/>
         </w:rPr>
@@ -2634,13 +2552,11 @@
     <w:p>
       <w:pPr>
         <w:pStyle w:val="SpanishTranslationDraft"/>
-        <w:spacing w:before="0" w:after="120"/>
-        <w:ind w:left="259"/>
-      </w:pPr>
-      <w:r>
-        <w:rPr>
-          <w:rFonts w:ascii="Times New Roman" w:hAnsi="Times New Roman"/>
-          <w:i/>
+        <w:ind w:right="259"/>
+      </w:pPr>
+      <w:r>
+        <w:rPr>
+          <w:rFonts w:ascii="Arial" w:hAnsi="Arial"/>
           <w:color w:val="0066CC"/>
           <w:sz w:val="18"/>
         </w:rPr>
@@ -2706,13 +2622,11 @@
     <w:p>
       <w:pPr>
         <w:pStyle w:val="SpanishTranslationDraft"/>
-        <w:spacing w:before="0" w:after="120"/>
-        <w:ind w:left="259"/>
-      </w:pPr>
-      <w:r>
-        <w:rPr>
-          <w:rFonts w:ascii="Times New Roman" w:hAnsi="Times New Roman"/>
-          <w:i/>
+        <w:ind w:right="259"/>
+      </w:pPr>
+      <w:r>
+        <w:rPr>
+          <w:rFonts w:ascii="Arial" w:hAnsi="Arial"/>
           <w:color w:val="0066CC"/>
           <w:sz w:val="18"/>
         </w:rPr>
@@ -2778,13 +2692,11 @@
     <w:p>
       <w:pPr>
         <w:pStyle w:val="SpanishTranslationDraft"/>
-        <w:spacing w:before="0" w:after="120"/>
-        <w:ind w:left="259"/>
-      </w:pPr>
-      <w:r>
-        <w:rPr>
-          <w:rFonts w:ascii="Times New Roman" w:hAnsi="Times New Roman"/>
-          <w:i/>
+        <w:ind w:right="259"/>
+      </w:pPr>
+      <w:r>
+        <w:rPr>
+          <w:rFonts w:ascii="Arial" w:hAnsi="Arial"/>
           <w:color w:val="0066CC"/>
           <w:sz w:val="18"/>
         </w:rPr>
@@ -2823,13 +2735,11 @@
     <w:p>
       <w:pPr>
         <w:pStyle w:val="SpanishTranslationDraft"/>
-        <w:spacing w:before="0" w:after="120"/>
-        <w:ind w:left="259"/>
-      </w:pPr>
-      <w:r>
-        <w:rPr>
-          <w:rFonts w:ascii="Times New Roman" w:hAnsi="Times New Roman"/>
-          <w:i/>
+        <w:ind w:right="259"/>
+      </w:pPr>
+      <w:r>
+        <w:rPr>
+          <w:rFonts w:ascii="Arial" w:hAnsi="Arial"/>
           <w:color w:val="0066CC"/>
           <w:sz w:val="18"/>
         </w:rPr>
@@ -2869,13 +2779,11 @@
     <w:p>
       <w:pPr>
         <w:pStyle w:val="SpanishTranslationDraft"/>
-        <w:spacing w:before="0" w:after="120"/>
-        <w:ind w:left="259"/>
-      </w:pPr>
-      <w:r>
-        <w:rPr>
-          <w:rFonts w:ascii="Times New Roman" w:hAnsi="Times New Roman"/>
-          <w:i/>
+        <w:ind w:right="259"/>
+      </w:pPr>
+      <w:r>
+        <w:rPr>
+          <w:rFonts w:ascii="Arial" w:hAnsi="Arial"/>
           <w:color w:val="0066CC"/>
           <w:sz w:val="18"/>
         </w:rPr>
@@ -2922,13 +2830,11 @@
     <w:p>
       <w:pPr>
         <w:pStyle w:val="SpanishTranslationDraft"/>
-        <w:spacing w:before="0" w:after="120"/>
-        <w:ind w:left="259"/>
-      </w:pPr>
-      <w:r>
-        <w:rPr>
-          <w:rFonts w:ascii="Times New Roman" w:hAnsi="Times New Roman"/>
-          <w:i/>
+        <w:ind w:right="259"/>
+      </w:pPr>
+      <w:r>
+        <w:rPr>
+          <w:rFonts w:ascii="Arial" w:hAnsi="Arial"/>
           <w:color w:val="0066CC"/>
           <w:sz w:val="18"/>
         </w:rPr>
@@ -3004,13 +2910,11 @@
     <w:p>
       <w:pPr>
         <w:pStyle w:val="SpanishTranslationDraft"/>
-        <w:spacing w:before="0" w:after="120"/>
-        <w:ind w:left="259"/>
-      </w:pPr>
-      <w:r>
-        <w:rPr>
-          <w:rFonts w:ascii="Times New Roman" w:hAnsi="Times New Roman"/>
-          <w:i/>
+        <w:ind w:right="259"/>
+      </w:pPr>
+      <w:r>
+        <w:rPr>
+          <w:rFonts w:ascii="Arial" w:hAnsi="Arial"/>
           <w:color w:val="0066CC"/>
           <w:sz w:val="18"/>
         </w:rPr>
@@ -3062,13 +2966,11 @@
     <w:p>
       <w:pPr>
         <w:pStyle w:val="SpanishTranslationDraft"/>
-        <w:spacing w:before="0" w:after="120"/>
-        <w:ind w:left="259"/>
-      </w:pPr>
-      <w:r>
-        <w:rPr>
-          <w:rFonts w:ascii="Times New Roman" w:hAnsi="Times New Roman"/>
-          <w:i/>
+        <w:ind w:right="259"/>
+      </w:pPr>
+      <w:r>
+        <w:rPr>
+          <w:rFonts w:ascii="Arial" w:hAnsi="Arial"/>
           <w:color w:val="0066CC"/>
           <w:sz w:val="18"/>
         </w:rPr>
@@ -3403,13 +3305,11 @@
     <w:p>
       <w:pPr>
         <w:pStyle w:val="SpanishTranslationDraft"/>
-        <w:spacing w:before="0" w:after="120"/>
-        <w:ind w:left="259"/>
-      </w:pPr>
-      <w:r>
-        <w:rPr>
-          <w:rFonts w:ascii="Times New Roman" w:hAnsi="Times New Roman"/>
-          <w:i/>
+        <w:ind w:right="259"/>
+      </w:pPr>
+      <w:r>
+        <w:rPr>
+          <w:rFonts w:ascii="Arial" w:hAnsi="Arial"/>
           <w:color w:val="0066CC"/>
           <w:sz w:val="18"/>
         </w:rPr>
@@ -3479,13 +3379,11 @@
     <w:p>
       <w:pPr>
         <w:pStyle w:val="SpanishTranslationDraft"/>
-        <w:spacing w:before="0" w:after="120"/>
-        <w:ind w:left="259"/>
-      </w:pPr>
-      <w:r>
-        <w:rPr>
-          <w:rFonts w:ascii="Times New Roman" w:hAnsi="Times New Roman"/>
-          <w:i/>
+        <w:ind w:right="259"/>
+      </w:pPr>
+      <w:r>
+        <w:rPr>
+          <w:rFonts w:ascii="Arial" w:hAnsi="Arial"/>
           <w:color w:val="0066CC"/>
           <w:sz w:val="18"/>
         </w:rPr>
@@ -3551,13 +3449,11 @@
     <w:p>
       <w:pPr>
         <w:pStyle w:val="SpanishTranslationDraft"/>
-        <w:spacing w:before="0" w:after="120"/>
-        <w:ind w:left="259"/>
-      </w:pPr>
-      <w:r>
-        <w:rPr>
-          <w:rFonts w:ascii="Times New Roman" w:hAnsi="Times New Roman"/>
-          <w:i/>
+        <w:ind w:right="259"/>
+      </w:pPr>
+      <w:r>
+        <w:rPr>
+          <w:rFonts w:ascii="Arial" w:hAnsi="Arial"/>
           <w:color w:val="0066CC"/>
           <w:sz w:val="18"/>
         </w:rPr>
@@ -3622,13 +3518,11 @@
     <w:p>
       <w:pPr>
         <w:pStyle w:val="SpanishTranslationDraft"/>
-        <w:spacing w:before="0" w:after="120"/>
-        <w:ind w:left="259"/>
-      </w:pPr>
-      <w:r>
-        <w:rPr>
-          <w:rFonts w:ascii="Times New Roman" w:hAnsi="Times New Roman"/>
-          <w:i/>
+        <w:ind w:right="259"/>
+      </w:pPr>
+      <w:r>
+        <w:rPr>
+          <w:rFonts w:ascii="Arial" w:hAnsi="Arial"/>
           <w:color w:val="0066CC"/>
           <w:sz w:val="18"/>
         </w:rPr>
@@ -3662,13 +3556,11 @@
     <w:p>
       <w:pPr>
         <w:pStyle w:val="SpanishTranslationDraft"/>
-        <w:spacing w:before="0" w:after="120"/>
-        <w:ind w:left="259"/>
-      </w:pPr>
-      <w:r>
-        <w:rPr>
-          <w:rFonts w:ascii="Times New Roman" w:hAnsi="Times New Roman"/>
-          <w:i/>
+        <w:ind w:right="259"/>
+      </w:pPr>
+      <w:r>
+        <w:rPr>
+          <w:rFonts w:ascii="Arial" w:hAnsi="Arial"/>
           <w:color w:val="0066CC"/>
           <w:sz w:val="18"/>
         </w:rPr>
@@ -3725,13 +3617,12 @@
     <w:p>
       <w:pPr>
         <w:pStyle w:val="SpanishTranslationDraft"/>
-        <w:spacing w:before="0" w:after="120"/>
-        <w:ind w:left="259"/>
-      </w:pPr>
-      <w:r>
-        <w:rPr>
-          <w:rFonts w:ascii="Times New Roman" w:hAnsi="Times New Roman"/>
-          <w:i/>
+        <w:ind w:right="259"/>
+        <w:jc w:val="center"/>
+      </w:pPr>
+      <w:r>
+        <w:rPr>
+          <w:rFonts w:ascii="Arial" w:hAnsi="Arial"/>
           <w:color w:val="0066CC"/>
           <w:sz w:val="18"/>
         </w:rPr>
@@ -3801,13 +3692,11 @@
     <w:p>
       <w:pPr>
         <w:pStyle w:val="SpanishTranslationDraft"/>
-        <w:spacing w:before="0" w:after="120"/>
-        <w:ind w:left="259"/>
-      </w:pPr>
-      <w:r>
-        <w:rPr>
-          <w:rFonts w:ascii="Times New Roman" w:hAnsi="Times New Roman"/>
-          <w:i/>
+        <w:ind w:right="259"/>
+      </w:pPr>
+      <w:r>
+        <w:rPr>
+          <w:rFonts w:ascii="Arial" w:hAnsi="Arial"/>
           <w:color w:val="0066CC"/>
           <w:sz w:val="18"/>
         </w:rPr>
@@ -3867,13 +3756,11 @@
     <w:p>
       <w:pPr>
         <w:pStyle w:val="SpanishTranslationDraft"/>
-        <w:spacing w:before="0" w:after="120"/>
-        <w:ind w:left="259"/>
-      </w:pPr>
-      <w:r>
-        <w:rPr>
-          <w:rFonts w:ascii="Times New Roman" w:hAnsi="Times New Roman"/>
-          <w:i/>
+        <w:ind w:right="259"/>
+      </w:pPr>
+      <w:r>
+        <w:rPr>
+          <w:rFonts w:ascii="Arial" w:hAnsi="Arial"/>
           <w:color w:val="0066CC"/>
           <w:sz w:val="18"/>
         </w:rPr>
@@ -3932,13 +3819,11 @@
     <w:p>
       <w:pPr>
         <w:pStyle w:val="SpanishTranslationDraft"/>
-        <w:spacing w:before="0" w:after="120"/>
-        <w:ind w:left="259"/>
-      </w:pPr>
-      <w:r>
-        <w:rPr>
-          <w:rFonts w:ascii="Times New Roman" w:hAnsi="Times New Roman"/>
-          <w:i/>
+        <w:ind w:right="259"/>
+      </w:pPr>
+      <w:r>
+        <w:rPr>
+          <w:rFonts w:ascii="Arial" w:hAnsi="Arial"/>
           <w:color w:val="0066CC"/>
           <w:sz w:val="18"/>
         </w:rPr>
@@ -3982,13 +3867,11 @@
     <w:p>
       <w:pPr>
         <w:pStyle w:val="SpanishTranslationDraft"/>
-        <w:spacing w:before="0" w:after="120"/>
-        <w:ind w:left="259"/>
-      </w:pPr>
-      <w:r>
-        <w:rPr>
-          <w:rFonts w:ascii="Times New Roman" w:hAnsi="Times New Roman"/>
-          <w:i/>
+        <w:ind w:right="259"/>
+      </w:pPr>
+      <w:r>
+        <w:rPr>
+          <w:rFonts w:ascii="Arial" w:hAnsi="Arial"/>
           <w:color w:val="0066CC"/>
           <w:sz w:val="18"/>
         </w:rPr>
@@ -4083,13 +3966,11 @@
     <w:p>
       <w:pPr>
         <w:pStyle w:val="SpanishTranslationDraft"/>
-        <w:spacing w:before="0" w:after="120"/>
-        <w:ind w:left="259"/>
-      </w:pPr>
-      <w:r>
-        <w:rPr>
-          <w:rFonts w:ascii="Times New Roman" w:hAnsi="Times New Roman"/>
-          <w:i/>
+        <w:ind w:right="259"/>
+      </w:pPr>
+      <w:r>
+        <w:rPr>
+          <w:rFonts w:ascii="Arial" w:hAnsi="Arial"/>
           <w:color w:val="0066CC"/>
           <w:sz w:val="18"/>
         </w:rPr>
@@ -4335,13 +4216,11 @@
     <w:p>
       <w:pPr>
         <w:pStyle w:val="SpanishTranslationDraft"/>
-        <w:spacing w:before="0" w:after="120"/>
-        <w:ind w:left="259"/>
-      </w:pPr>
-      <w:r>
-        <w:rPr>
-          <w:rFonts w:ascii="Times New Roman" w:hAnsi="Times New Roman"/>
-          <w:i/>
+        <w:ind w:right="259"/>
+      </w:pPr>
+      <w:r>
+        <w:rPr>
+          <w:rFonts w:ascii="Arial" w:hAnsi="Arial"/>
           <w:color w:val="0066CC"/>
           <w:sz w:val="18"/>
         </w:rPr>
@@ -4402,13 +4281,11 @@
     <w:p>
       <w:pPr>
         <w:pStyle w:val="SpanishTranslationDraft"/>
-        <w:spacing w:before="0" w:after="120"/>
-        <w:ind w:left="259"/>
-      </w:pPr>
-      <w:r>
-        <w:rPr>
-          <w:rFonts w:ascii="Times New Roman" w:hAnsi="Times New Roman"/>
-          <w:i/>
+        <w:ind w:right="259"/>
+      </w:pPr>
+      <w:r>
+        <w:rPr>
+          <w:rFonts w:ascii="Arial" w:hAnsi="Arial"/>
           <w:color w:val="0066CC"/>
           <w:sz w:val="18"/>
         </w:rPr>
@@ -4453,13 +4330,11 @@
     <w:p>
       <w:pPr>
         <w:pStyle w:val="SpanishTranslationDraft"/>
-        <w:spacing w:before="0" w:after="120"/>
-        <w:ind w:left="259"/>
-      </w:pPr>
-      <w:r>
-        <w:rPr>
-          <w:rFonts w:ascii="Times New Roman" w:hAnsi="Times New Roman"/>
-          <w:i/>
+        <w:ind w:right="259"/>
+      </w:pPr>
+      <w:r>
+        <w:rPr>
+          <w:rFonts w:ascii="Arial" w:hAnsi="Arial"/>
           <w:color w:val="0066CC"/>
           <w:sz w:val="18"/>
         </w:rPr>
@@ -4491,13 +4366,11 @@
     <w:p>
       <w:pPr>
         <w:pStyle w:val="SpanishTranslationDraft"/>
-        <w:spacing w:before="0" w:after="120"/>
-        <w:ind w:left="259"/>
-      </w:pPr>
-      <w:r>
-        <w:rPr>
-          <w:rFonts w:ascii="Times New Roman" w:hAnsi="Times New Roman"/>
-          <w:i/>
+        <w:ind w:right="259"/>
+      </w:pPr>
+      <w:r>
+        <w:rPr>
+          <w:rFonts w:ascii="Arial" w:hAnsi="Arial"/>
           <w:color w:val="0066CC"/>
           <w:sz w:val="18"/>
         </w:rPr>
@@ -4530,13 +4403,11 @@
     <w:p>
       <w:pPr>
         <w:pStyle w:val="SpanishTranslationDraft"/>
-        <w:spacing w:before="0" w:after="120"/>
-        <w:ind w:left="259"/>
-      </w:pPr>
-      <w:r>
-        <w:rPr>
-          <w:rFonts w:ascii="Times New Roman" w:hAnsi="Times New Roman"/>
-          <w:i/>
+        <w:ind w:right="259"/>
+      </w:pPr>
+      <w:r>
+        <w:rPr>
+          <w:rFonts w:ascii="Arial" w:hAnsi="Arial"/>
           <w:color w:val="0066CC"/>
           <w:sz w:val="18"/>
         </w:rPr>
@@ -4609,13 +4480,11 @@
     <w:p>
       <w:pPr>
         <w:pStyle w:val="SpanishTranslationDraft"/>
-        <w:spacing w:before="0" w:after="120"/>
-        <w:ind w:left="259"/>
-      </w:pPr>
-      <w:r>
-        <w:rPr>
-          <w:rFonts w:ascii="Times New Roman" w:hAnsi="Times New Roman"/>
-          <w:i/>
+        <w:ind w:right="259"/>
+      </w:pPr>
+      <w:r>
+        <w:rPr>
+          <w:rFonts w:ascii="Arial" w:hAnsi="Arial"/>
           <w:color w:val="0066CC"/>
           <w:sz w:val="18"/>
         </w:rPr>
@@ -4708,13 +4577,11 @@
     <w:p>
       <w:pPr>
         <w:pStyle w:val="SpanishTranslationDraft"/>
-        <w:spacing w:before="0" w:after="120"/>
-        <w:ind w:left="259"/>
-      </w:pPr>
-      <w:r>
-        <w:rPr>
-          <w:rFonts w:ascii="Times New Roman" w:hAnsi="Times New Roman"/>
-          <w:i/>
+        <w:ind w:right="259"/>
+      </w:pPr>
+      <w:r>
+        <w:rPr>
+          <w:rFonts w:ascii="Arial" w:hAnsi="Arial"/>
           <w:color w:val="0066CC"/>
           <w:sz w:val="18"/>
         </w:rPr>
@@ -4773,13 +4640,11 @@
     <w:p>
       <w:pPr>
         <w:pStyle w:val="SpanishTranslationDraft"/>
-        <w:spacing w:before="0" w:after="120"/>
-        <w:ind w:left="259"/>
-      </w:pPr>
-      <w:r>
-        <w:rPr>
-          <w:rFonts w:ascii="Times New Roman" w:hAnsi="Times New Roman"/>
-          <w:i/>
+        <w:ind w:right="259"/>
+      </w:pPr>
+      <w:r>
+        <w:rPr>
+          <w:rFonts w:ascii="Arial" w:hAnsi="Arial"/>
           <w:color w:val="0066CC"/>
           <w:sz w:val="18"/>
         </w:rPr>
@@ -4865,13 +4730,11 @@
     <w:p>
       <w:pPr>
         <w:pStyle w:val="SpanishTranslationDraft"/>
-        <w:spacing w:before="0" w:after="120"/>
-        <w:ind w:left="259"/>
-      </w:pPr>
-      <w:r>
-        <w:rPr>
-          <w:rFonts w:ascii="Times New Roman" w:hAnsi="Times New Roman"/>
-          <w:i/>
+        <w:ind w:right="259"/>
+      </w:pPr>
+      <w:r>
+        <w:rPr>
+          <w:rFonts w:ascii="Arial" w:hAnsi="Arial"/>
           <w:color w:val="0066CC"/>
           <w:sz w:val="18"/>
         </w:rPr>
@@ -4911,13 +4774,11 @@
     <w:p>
       <w:pPr>
         <w:pStyle w:val="SpanishTranslationDraft"/>
-        <w:spacing w:before="0" w:after="120"/>
-        <w:ind w:left="259"/>
-      </w:pPr>
-      <w:r>
-        <w:rPr>
-          <w:rFonts w:ascii="Times New Roman" w:hAnsi="Times New Roman"/>
-          <w:i/>
+        <w:ind w:right="259"/>
+      </w:pPr>
+      <w:r>
+        <w:rPr>
+          <w:rFonts w:ascii="Arial" w:hAnsi="Arial"/>
           <w:color w:val="0066CC"/>
           <w:sz w:val="18"/>
         </w:rPr>
@@ -4939,13 +4800,11 @@
     <w:p>
       <w:pPr>
         <w:pStyle w:val="SpanishTranslationDraft"/>
-        <w:spacing w:before="0" w:after="120"/>
-        <w:ind w:left="259"/>
-      </w:pPr>
-      <w:r>
-        <w:rPr>
-          <w:rFonts w:ascii="Times New Roman" w:hAnsi="Times New Roman"/>
-          <w:i/>
+        <w:ind w:right="259"/>
+      </w:pPr>
+      <w:r>
+        <w:rPr>
+          <w:rFonts w:ascii="Arial" w:hAnsi="Arial"/>
           <w:color w:val="0066CC"/>
           <w:sz w:val="18"/>
         </w:rPr>
@@ -4977,13 +4836,11 @@
     <w:p>
       <w:pPr>
         <w:pStyle w:val="SpanishTranslationDraft"/>
-        <w:spacing w:before="0" w:after="120"/>
-        <w:ind w:left="259"/>
-      </w:pPr>
-      <w:r>
-        <w:rPr>
-          <w:rFonts w:ascii="Times New Roman" w:hAnsi="Times New Roman"/>
-          <w:i/>
+        <w:ind w:right="259"/>
+      </w:pPr>
+      <w:r>
+        <w:rPr>
+          <w:rFonts w:ascii="Arial" w:hAnsi="Arial"/>
           <w:color w:val="0066CC"/>
           <w:sz w:val="18"/>
         </w:rPr>
@@ -5015,13 +4872,11 @@
     <w:p>
       <w:pPr>
         <w:pStyle w:val="SpanishTranslationDraft"/>
-        <w:spacing w:before="0" w:after="120"/>
-        <w:ind w:left="259"/>
-      </w:pPr>
-      <w:r>
-        <w:rPr>
-          <w:rFonts w:ascii="Times New Roman" w:hAnsi="Times New Roman"/>
-          <w:i/>
+        <w:ind w:right="259"/>
+      </w:pPr>
+      <w:r>
+        <w:rPr>
+          <w:rFonts w:ascii="Arial" w:hAnsi="Arial"/>
           <w:color w:val="0066CC"/>
           <w:sz w:val="18"/>
         </w:rPr>
@@ -5053,13 +4908,11 @@
     <w:p>
       <w:pPr>
         <w:pStyle w:val="SpanishTranslationDraft"/>
-        <w:spacing w:before="0" w:after="120"/>
-        <w:ind w:left="259"/>
-      </w:pPr>
-      <w:r>
-        <w:rPr>
-          <w:rFonts w:ascii="Times New Roman" w:hAnsi="Times New Roman"/>
-          <w:i/>
+        <w:ind w:right="259"/>
+      </w:pPr>
+      <w:r>
+        <w:rPr>
+          <w:rFonts w:ascii="Arial" w:hAnsi="Arial"/>
           <w:color w:val="0066CC"/>
           <w:sz w:val="18"/>
         </w:rPr>
@@ -5091,13 +4944,11 @@
     <w:p>
       <w:pPr>
         <w:pStyle w:val="SpanishTranslationDraft"/>
-        <w:spacing w:before="0" w:after="120"/>
-        <w:ind w:left="259"/>
-      </w:pPr>
-      <w:r>
-        <w:rPr>
-          <w:rFonts w:ascii="Times New Roman" w:hAnsi="Times New Roman"/>
-          <w:i/>
+        <w:ind w:right="259"/>
+      </w:pPr>
+      <w:r>
+        <w:rPr>
+          <w:rFonts w:ascii="Arial" w:hAnsi="Arial"/>
           <w:color w:val="0066CC"/>
           <w:sz w:val="18"/>
         </w:rPr>
@@ -5129,13 +4980,11 @@
     <w:p>
       <w:pPr>
         <w:pStyle w:val="SpanishTranslationDraft"/>
-        <w:spacing w:before="0" w:after="120"/>
-        <w:ind w:left="259"/>
-      </w:pPr>
-      <w:r>
-        <w:rPr>
-          <w:rFonts w:ascii="Times New Roman" w:hAnsi="Times New Roman"/>
-          <w:i/>
+        <w:ind w:right="259"/>
+      </w:pPr>
+      <w:r>
+        <w:rPr>
+          <w:rFonts w:ascii="Arial" w:hAnsi="Arial"/>
           <w:color w:val="0066CC"/>
           <w:sz w:val="18"/>
         </w:rPr>
@@ -5189,13 +5038,11 @@
     <w:p>
       <w:pPr>
         <w:pStyle w:val="SpanishTranslationDraft"/>
-        <w:spacing w:before="0" w:after="120"/>
-        <w:ind w:left="259"/>
-      </w:pPr>
-      <w:r>
-        <w:rPr>
-          <w:rFonts w:ascii="Times New Roman" w:hAnsi="Times New Roman"/>
-          <w:i/>
+        <w:ind w:right="259"/>
+      </w:pPr>
+      <w:r>
+        <w:rPr>
+          <w:rFonts w:ascii="Arial" w:hAnsi="Arial"/>
           <w:color w:val="0066CC"/>
           <w:sz w:val="18"/>
         </w:rPr>
@@ -5285,13 +5132,11 @@
     <w:p>
       <w:pPr>
         <w:pStyle w:val="SpanishTranslationDraft"/>
-        <w:spacing w:before="0" w:after="120"/>
-        <w:ind w:left="259"/>
-      </w:pPr>
-      <w:r>
-        <w:rPr>
-          <w:rFonts w:ascii="Times New Roman" w:hAnsi="Times New Roman"/>
-          <w:i/>
+        <w:ind w:right="259"/>
+      </w:pPr>
+      <w:r>
+        <w:rPr>
+          <w:rFonts w:ascii="Arial" w:hAnsi="Arial"/>
           <w:color w:val="0066CC"/>
           <w:sz w:val="18"/>
         </w:rPr>
@@ -5403,13 +5248,11 @@
     <w:p>
       <w:pPr>
         <w:pStyle w:val="SpanishTranslationDraft"/>
-        <w:spacing w:before="0" w:after="120"/>
-        <w:ind w:left="259"/>
-      </w:pPr>
-      <w:r>
-        <w:rPr>
-          <w:rFonts w:ascii="Times New Roman" w:hAnsi="Times New Roman"/>
-          <w:i/>
+        <w:ind w:right="259"/>
+      </w:pPr>
+      <w:r>
+        <w:rPr>
+          <w:rFonts w:ascii="Arial" w:hAnsi="Arial"/>
           <w:color w:val="0066CC"/>
           <w:sz w:val="18"/>
         </w:rPr>
@@ -5482,13 +5325,11 @@
     <w:p>
       <w:pPr>
         <w:pStyle w:val="SpanishTranslationDraft"/>
-        <w:spacing w:before="0" w:after="120"/>
-        <w:ind w:left="259"/>
-      </w:pPr>
-      <w:r>
-        <w:rPr>
-          <w:rFonts w:ascii="Times New Roman" w:hAnsi="Times New Roman"/>
-          <w:i/>
+        <w:ind w:right="259"/>
+      </w:pPr>
+      <w:r>
+        <w:rPr>
+          <w:rFonts w:ascii="Arial" w:hAnsi="Arial"/>
           <w:color w:val="0066CC"/>
           <w:sz w:val="18"/>
         </w:rPr>
@@ -6266,7 +6107,7 @@
           <w:szCs w:val="28"/>
           <w:u w:val="single"/>
         </w:rPr>
-        <w:t>Investment Services LLC, Trustee - Al Bennett, Manager</w:t>
+        <w:t>Investment Services LLC, Trustee - José Fabre Jr., Manager</w:t>
       </w:r>
     </w:p>
     <w:p>
@@ -6754,7 +6595,7 @@
     </w:p>
     <w:p>
       <w:r>
-        <w:t>I certify that the following person(s) personally appeared before me this day, each acknowledging to me that he/she/they signed the foregoing document: Al Bennett, Manager of Investment Services LLC, Trustee of 320 Rose Pl Real Estate Trust dated March, 5 2025.</w:t>
+        <w:t>I certify that the following person(s) personally appeared before me this day, each acknowledging to me that he/she/they signed the foregoing document: José Fabre Jr., Manager of Investment Services LLC, Trustee of 320 Rose Pl Real Estate Trust dated March, 5 2025.</w:t>
       </w:r>
     </w:p>
     <w:p>
@@ -8750,14 +8591,11 @@
   </w:style>
   <w:style w:type="paragraph" w:customStyle="1" w:styleId="SpanishTranslationDraft">
     <w:name w:val="Spanish Translation Draft"/>
-    <w:basedOn w:val="Normal"/>
     <w:pPr>
-      <w:spacing w:before="0" w:after="120"/>
-      <w:ind w:left="259"/>
+      <w:ind w:right="259"/>
     </w:pPr>
     <w:rPr>
-      <w:rFonts w:ascii="Times New Roman" w:hAnsi="Times New Roman"/>
-      <w:i/>
+      <w:rFonts w:ascii="Arial" w:hAnsi="Arial"/>
       <w:color w:val="0066CC"/>
       <w:sz w:val="18"/>
     </w:rPr>

</xml_diff>